<commit_message>
Fix : Added Sitecore SCS option
</commit_message>
<xml_diff>
--- a/ReadMe.docx
+++ b/ReadMe.docx
@@ -92,6 +92,13 @@
         </w:rPr>
         <w:t>A. Installing the Optimizely NuGet Package</w:t>
       </w:r>
+      <w:r>
+        <w:rPr>
+          <w:b/>
+          <w:bCs/>
+        </w:rPr>
+        <w:t xml:space="preserve"> to your Optimizely project</w:t>
+      </w:r>
     </w:p>
     <w:p>
       <w:r>
@@ -103,7 +110,15 @@
           <w:bCs/>
           <w:highlight w:val="yellow"/>
         </w:rPr>
-        <w:t>OptimizelyToSitecore.Accelerator.Toolkit.1.0.0.nupkg</w:t>
+        <w:t>OptimizelyToSitecore.Accelerator.Toolkit.8.10.26</w:t>
+      </w:r>
+      <w:r>
+        <w:rPr>
+          <w:b/>
+          <w:bCs/>
+          <w:highlight w:val="yellow"/>
+        </w:rPr>
+        <w:t>.nupkg</w:t>
       </w:r>
     </w:p>
     <w:p>
@@ -186,6 +201,40 @@
         <w:ind w:left="720"/>
       </w:pPr>
       <w:r>
+        <w:rPr>
+          <w:highlight w:val="yellow"/>
+        </w:rPr>
+        <w:t>OR</w:t>
+      </w:r>
+      <w:r>
+        <w:t xml:space="preserve"> directly open your .csproj file of your Optimizely project and add reference of Accelerator package</w:t>
+      </w:r>
+      <w:r>
+        <w:t xml:space="preserve"> as below</w:t>
+      </w:r>
+      <w:r>
+        <w:t xml:space="preserve"> – </w:t>
+      </w:r>
+    </w:p>
+    <w:p>
+      <w:pPr>
+        <w:ind w:left="720"/>
+      </w:pPr>
+      <w:r>
+        <w:t>&lt;PackageReference Include="OptimizelyToSitecore.Accelerator.Toolkit" Version="8.10.26" /&gt;</w:t>
+      </w:r>
+      <w:r>
+        <w:t xml:space="preserve"> </w:t>
+      </w:r>
+    </w:p>
+    <w:p>
+      <w:pPr>
+        <w:ind w:left="720"/>
+      </w:pPr>
+      <w:r>
+        <w:rPr>
+          <w:noProof/>
+        </w:rPr>
         <w:lastRenderedPageBreak/>
         <w:drawing>
           <wp:inline distT="0" distB="0" distL="0" distR="0" wp14:anchorId="09ED4DD4" wp14:editId="4A6F8829">
@@ -226,6 +275,11 @@
     </w:p>
     <w:p>
       <w:pPr>
+        <w:ind w:left="720"/>
+      </w:pPr>
+    </w:p>
+    <w:p>
+      <w:pPr>
         <w:numPr>
           <w:ilvl w:val="0"/>
           <w:numId w:val="1"/>
@@ -250,6 +304,9 @@
         <w:ind w:left="720"/>
       </w:pPr>
       <w:r>
+        <w:rPr>
+          <w:noProof/>
+        </w:rPr>
         <w:drawing>
           <wp:inline distT="0" distB="0" distL="0" distR="0" wp14:anchorId="135A8440" wp14:editId="485CE427">
             <wp:extent cx="5943600" cy="2574290"/>
@@ -306,6 +363,13 @@
         </w:rPr>
         <w:t>B. Installing the Sitecore PowerShell Toolkit</w:t>
       </w:r>
+      <w:r>
+        <w:rPr>
+          <w:b/>
+          <w:bCs/>
+        </w:rPr>
+        <w:t xml:space="preserve"> to your Sitecore instance</w:t>
+      </w:r>
     </w:p>
     <w:p>
       <w:r>
@@ -320,6 +384,7 @@
         </w:numPr>
       </w:pPr>
       <w:r>
+        <w:lastRenderedPageBreak/>
         <w:t xml:space="preserve">Log into your </w:t>
       </w:r>
       <w:r>
@@ -341,7 +406,6 @@
         </w:numPr>
       </w:pPr>
       <w:r>
-        <w:lastRenderedPageBreak/>
         <w:t xml:space="preserve">Navigate to </w:t>
       </w:r>
       <w:r>
@@ -385,6 +449,84 @@
     </w:p>
     <w:p>
       <w:pPr>
+        <w:ind w:left="720"/>
+      </w:pPr>
+      <w:r>
+        <w:rPr>
+          <w:b/>
+          <w:bCs/>
+          <w:highlight w:val="yellow"/>
+        </w:rPr>
+        <w:t>OR</w:t>
+      </w:r>
+      <w:r>
+        <w:t xml:space="preserve"> </w:t>
+      </w:r>
+      <w:r>
+        <w:rPr>
+          <w:highlight w:val="green"/>
+        </w:rPr>
+        <w:t>As Sitecore 10.5 onwards</w:t>
+      </w:r>
+      <w:r>
+        <w:t xml:space="preserve">, the package installation is not available, you can use </w:t>
+      </w:r>
+      <w:r>
+        <w:rPr>
+          <w:highlight w:val="green"/>
+        </w:rPr>
+        <w:t>Sitecore Content Serialization (SCS)</w:t>
+      </w:r>
+      <w:r>
+        <w:t xml:space="preserve"> Item Packages (.itempackage)</w:t>
+      </w:r>
+    </w:p>
+    <w:p>
+      <w:pPr>
+        <w:ind w:left="720"/>
+        <w:rPr>
+          <w:b/>
+          <w:bCs/>
+        </w:rPr>
+      </w:pPr>
+      <w:r>
+        <w:rPr>
+          <w:b/>
+          <w:bCs/>
+          <w:highlight w:val="yellow"/>
+        </w:rPr>
+        <w:t>Optimizely-To-Sitecore-Accelerator-Toolkit-1.0.itempackage</w:t>
+      </w:r>
+    </w:p>
+    <w:p>
+      <w:pPr>
+        <w:ind w:left="720"/>
+      </w:pPr>
+      <w:r>
+        <w:t>Which is also present under Installer</w:t>
+      </w:r>
+      <w:r>
+        <w:t>s</w:t>
+      </w:r>
+      <w:r>
+        <w:t xml:space="preserve"> folder.</w:t>
+      </w:r>
+    </w:p>
+    <w:p>
+      <w:pPr>
+        <w:ind w:left="720"/>
+      </w:pPr>
+      <w:r>
+        <w:t>dotnet sitecore ser pkg install -f ".\Optimizely-To-Sitecore-Accelerator-Toolkit-1.0.itempackage" -n your-first-XMC</w:t>
+      </w:r>
+    </w:p>
+    <w:p>
+      <w:pPr>
+        <w:ind w:left="720"/>
+      </w:pPr>
+    </w:p>
+    <w:p>
+      <w:pPr>
         <w:numPr>
           <w:ilvl w:val="0"/>
           <w:numId w:val="2"/>
@@ -417,8 +559,15 @@
     <w:p>
       <w:pPr>
         <w:ind w:left="720"/>
-      </w:pPr>
-      <w:r>
+        <w:rPr>
+          <w:b/>
+          <w:bCs/>
+        </w:rPr>
+      </w:pPr>
+      <w:r>
+        <w:rPr>
+          <w:noProof/>
+        </w:rPr>
         <w:drawing>
           <wp:inline distT="0" distB="0" distL="0" distR="0" wp14:anchorId="358468EE" wp14:editId="39FCC9E5">
             <wp:extent cx="5943600" cy="3365500"/>
@@ -493,6 +642,7 @@
     </w:p>
     <w:p>
       <w:r>
+        <w:lastRenderedPageBreak/>
         <w:t xml:space="preserve">If your implementation utilizes appsettings.json to manage the C# export destinations, </w:t>
       </w:r>
     </w:p>
@@ -542,7 +692,6 @@
     </w:p>
     <w:p>
       <w:r>
-        <w:lastRenderedPageBreak/>
         <w:t xml:space="preserve">      "IncludeMediaFiles": false,</w:t>
       </w:r>
     </w:p>
@@ -626,21 +775,7 @@
           <w:b/>
           <w:bCs/>
         </w:rPr>
-        <w:t>ContentExport</w:t>
-      </w:r>
-      <w:r>
-        <w:rPr>
-          <w:b/>
-          <w:bCs/>
-        </w:rPr>
-        <w:t xml:space="preserve"> .</w:t>
-      </w:r>
-      <w:r>
-        <w:rPr>
-          <w:b/>
-          <w:bCs/>
-        </w:rPr>
-        <w:t>ContentRootId</w:t>
+        <w:t>ContentExport .ContentRootId</w:t>
       </w:r>
       <w:r>
         <w:t>: The Optimizely Page/Folder ID (integer) where the content export should begin.</w:t>
@@ -658,21 +793,7 @@
           <w:b/>
           <w:bCs/>
         </w:rPr>
-        <w:t>ContentExport</w:t>
-      </w:r>
-      <w:r>
-        <w:rPr>
-          <w:b/>
-          <w:bCs/>
-        </w:rPr>
-        <w:t xml:space="preserve"> .</w:t>
-      </w:r>
-      <w:r>
-        <w:rPr>
-          <w:b/>
-          <w:bCs/>
-        </w:rPr>
-        <w:t>IncludeSubItems</w:t>
+        <w:t>ContentExport .IncludeSubItems</w:t>
       </w:r>
       <w:r>
         <w:t xml:space="preserve">: A boolean (true / false). When true, the export job will recursively traverse down the tree to export all descendants of the </w:t>
@@ -682,21 +803,7 @@
           <w:b/>
           <w:bCs/>
         </w:rPr>
-        <w:t>ContentExport</w:t>
-      </w:r>
-      <w:r>
-        <w:rPr>
-          <w:b/>
-          <w:bCs/>
-        </w:rPr>
-        <w:t xml:space="preserve"> .</w:t>
-      </w:r>
-      <w:r>
-        <w:rPr>
-          <w:b/>
-          <w:bCs/>
-        </w:rPr>
-        <w:t>ContentRootId</w:t>
+        <w:t>ContentExport .ContentRootId</w:t>
       </w:r>
       <w:r>
         <w:t>.</w:t>
@@ -714,21 +821,7 @@
           <w:b/>
           <w:bCs/>
         </w:rPr>
-        <w:t>ContentExport</w:t>
-      </w:r>
-      <w:r>
-        <w:rPr>
-          <w:b/>
-          <w:bCs/>
-        </w:rPr>
-        <w:t xml:space="preserve"> .</w:t>
-      </w:r>
-      <w:r>
-        <w:rPr>
-          <w:b/>
-          <w:bCs/>
-        </w:rPr>
-        <w:t>IncludeMediaFiles</w:t>
+        <w:t>ContentExport .IncludeMediaFiles</w:t>
       </w:r>
       <w:r>
         <w:t>: A boolean (true / false). When true, the bundle will automatically extract physical media blobs and generate the map.json file inside the ZIP.</w:t>
@@ -746,21 +839,8 @@
           <w:b/>
           <w:bCs/>
         </w:rPr>
-        <w:t>ContentExport</w:t>
-      </w:r>
-      <w:r>
-        <w:rPr>
-          <w:b/>
-          <w:bCs/>
-        </w:rPr>
-        <w:t xml:space="preserve"> .</w:t>
-      </w:r>
-      <w:r>
-        <w:rPr>
-          <w:b/>
-          <w:bCs/>
-        </w:rPr>
-        <w:t>TypesToExport</w:t>
+        <w:lastRenderedPageBreak/>
+        <w:t>ContentExport .TypesToExport</w:t>
       </w:r>
       <w:r>
         <w:t xml:space="preserve">: An optional array of specific Content Type names (e.g., ["ArticlePage"]). If provided, the tool will </w:t>
@@ -788,21 +868,7 @@
           <w:b/>
           <w:bCs/>
         </w:rPr>
-        <w:t>MediaExport</w:t>
-      </w:r>
-      <w:r>
-        <w:rPr>
-          <w:b/>
-          <w:bCs/>
-        </w:rPr>
-        <w:t>.</w:t>
-      </w:r>
-      <w:r>
-        <w:rPr>
-          <w:b/>
-          <w:bCs/>
-        </w:rPr>
-        <w:t>MediaFolderRootId</w:t>
+        <w:t>MediaExport.MediaFolderRootId</w:t>
       </w:r>
       <w:r>
         <w:t>:</w:t>
@@ -892,7 +958,6 @@
           <w:b/>
           <w:bCs/>
         </w:rPr>
-        <w:lastRenderedPageBreak/>
         <w:t>3.</w:t>
       </w:r>
       <w:r>
@@ -1259,6 +1324,7 @@
           <w:b/>
           <w:bCs/>
         </w:rPr>
+        <w:lastRenderedPageBreak/>
         <w:t>Extract:</w:t>
       </w:r>
       <w:r>
@@ -2848,6 +2914,7 @@
   <w:style w:type="character" w:default="1" w:styleId="DefaultParagraphFont">
     <w:name w:val="Default Paragraph Font"/>
     <w:uiPriority w:val="1"/>
+    <w:semiHidden/>
     <w:unhideWhenUsed/>
   </w:style>
   <w:style w:type="table" w:default="1" w:styleId="TableNormal">

</xml_diff>